<commit_message>
feat: add concept art for Scavenger suits and update project documentation
</commit_message>
<xml_diff>
--- a/Concept/Story/StormMega - Story.docx
+++ b/Concept/Story/StormMega - Story.docx
@@ -7,7 +7,7 @@
         <w:pStyle w:val="Heading1"/>
         <w:rPr/>
       </w:pPr>
-      <w:bookmarkStart w:colFirst="0" w:colLast="0" w:name="_rf7w7zma4nds" w:id="0"/>
+      <w:bookmarkStart w:colFirst="0" w:colLast="0" w:name="_rdm6opggfxjn" w:id="0"/>
       <w:bookmarkEnd w:id="0"/>
       <w:r>
         <w:rPr>
@@ -18,127 +18,459 @@
     </w:p>
     <w:p>
       <w:pPr>
+        <w:spacing w:after="240" w:before="240" w:lineRule="auto"/>
         <w:rPr/>
       </w:pPr>
       <w:r>
         <w:rPr>
           <w:b w:val="1"/>
           <w:bCs w:val="1"/>
-          <w:rtl w:val="0"/>
-        </w:rPr>
-        <w:t xml:space="preserve">Year XX2007</w:t>
-      </w:r>
-      <w:r>
-        <w:rPr>
-          <w:rtl w:val="0"/>
-        </w:rPr>
-      </w:r>
-    </w:p>
-    <w:p>
-      <w:pPr>
+          <w:sz w:val="26"/>
+          <w:szCs w:val="26"/>
+          <w:rtl w:val="0"/>
+        </w:rPr>
+        <w:t xml:space="preserve">Year: XX2007</w:t>
+        <w:br w:type="textWrapping"/>
+        <w:t xml:space="preserve">Place: Kaodo Universe</w:t>
+        <w:br w:type="textWrapping"/>
+        <w:t xml:space="preserve">Theme: Animated, Futuristic, Organic, Ideological Dystopia, Metaphysical, Hyper-Color</w:t>
+      </w:r>
+      <w:r>
+        <w:rPr>
+          <w:rtl w:val="0"/>
+        </w:rPr>
+      </w:r>
+    </w:p>
+    <w:p>
+      <w:pPr>
+        <w:spacing w:after="240" w:before="240" w:lineRule="auto"/>
         <w:rPr/>
       </w:pPr>
       <w:r>
         <w:rPr>
           <w:rtl w:val="0"/>
         </w:rPr>
-        <w:t xml:space="preserve">Your emergence on the planet Tarrastra in the year XX2007 was a singular event, defining you as a pure anomaly. Your existence is predicated on a terrifying form of immortality: death is not an end, but a calculated, temporary regression. When your essence is defeated, it instantly reverts to a protective, resilient egg, only to be reborn as a Scavenger, the initial form of the Anomaly-class entity. The fractured cosmos, dominated by mad alliances and decaying ideologies, relentlessly pursues your annihilation. They seek your obliteration not out of simple malice, but because you represent the final, untainted form of survival in a universe that has long since embraced its own ruin.</w:t>
-      </w:r>
-    </w:p>
-    <w:p>
-      <w:pPr>
+        <w:t xml:space="preserve">In this universe, reality is malleable. Power does not flow from mystical incantations, but from the raw weight of collective conviction. The mad factions of the cosmos actively harvest the fanatical belief of their followers to charge up their respective Conviction Cores—massive ideological engines that allow them to project their unique brand of tyranny across the universe. Magic is this ideology made manifest in bright, explosive colors and exaggerated forms. To the casual eye, the universe is a vibrant, animated spectacle, but beneath this bouncy, energetic surface lies a dark truth: factions vie for total dominance, twisting reality to fit their fanatical beliefs.</w:t>
+      </w:r>
+    </w:p>
+    <w:p>
+      <w:pPr>
+        <w:spacing w:after="240" w:before="240" w:lineRule="auto"/>
         <w:rPr/>
       </w:pPr>
       <w:r>
         <w:rPr>
           <w:rtl w:val="0"/>
         </w:rPr>
-      </w:r>
-    </w:p>
-    <w:p>
-      <w:pPr>
+        <w:t xml:space="preserve">At the center of this chaos are the shattered remnants of the Spark Prism—an ancient, crystalline artifact that once anchored the objective truth of the cosmos. Now, fragments of the Prism are scattered across the universe, hiding in unstable dimensional pockets. For the factions, securing them means forcing their twisted worldview upon reality permanently. But for you, the Prism is the key to the unknown. Finding and absorbing these shards does more than grant power; it unlocks the deepest mysteries of the universe, piecing together the fractured history of Tarrastra and revealing the forgotten truths of what existed before the madness began.</w:t>
+      </w:r>
+    </w:p>
+    <w:p>
+      <w:pPr>
+        <w:spacing w:after="240" w:before="240" w:lineRule="auto"/>
         <w:rPr/>
       </w:pPr>
       <w:r>
         <w:rPr>
           <w:rtl w:val="0"/>
         </w:rPr>
-        <w:t xml:space="preserve">This brutal, constant pursuit ignited a formidable, innate secondary power: the capability to incorporate the vital remnants of every fallen adversary into your Scavenger suit. The suit itself functions as a potent symbiotic organism, growing stronger with each successful encounter. Once a sufficient mass of these collected biological and technological fragments is amassed, the suit initiates an auto-consumption cycle, triggering dramatic evolutionary upgrades that perpetually enhance your class-specific capabilities for survival.</w:t>
-      </w:r>
-    </w:p>
-    <w:p>
-      <w:pPr>
+        <w:t xml:space="preserve">The Anomaly Lineage Your emergence on the planet Tarrastra in the year XX2007 was a singular event, defining you as a pure anomaly. However, the Anomaly is not merely a single entity, but a rare lineage of beings born with innate, biologically encoded class systems. While all Anomalies share a similar baseline humanoid form and share the terrifying immortality of reverting to a protective, resilient egg upon defeat, their specialized features and biological imperatives diverge drastically.</w:t>
+      </w:r>
+    </w:p>
+    <w:p>
+      <w:pPr>
+        <w:spacing w:after="240" w:before="240" w:lineRule="auto"/>
         <w:rPr/>
       </w:pPr>
       <w:r>
         <w:rPr>
           <w:rtl w:val="0"/>
         </w:rPr>
-      </w:r>
-    </w:p>
-    <w:p>
-      <w:pPr>
+        <w:t xml:space="preserve">The fractured cosmos relentlessly pursues your annihilation not out of simple malice, but because your entire kind represents a true void in the Conviction Core system. Anomalies bow to no ideology, making you completely immune to their magical influence. To combat the blinding noise of the factions, the Anomaly lineage is divided into five distinct, instinctual classes:</w:t>
+      </w:r>
+    </w:p>
+    <w:p>
+      <w:pPr>
+        <w:numPr>
+          <w:ilvl w:val="0"/>
+          <w:numId w:val="3"/>
+        </w:numPr>
+        <w:spacing w:after="0" w:afterAutospacing="0" w:before="240" w:lineRule="auto"/>
+        <w:ind w:left="720" w:hanging="360"/>
+      </w:pPr>
+      <w:r>
+        <w:rPr>
+          <w:b w:val="1"/>
+          <w:bCs w:val="1"/>
+          <w:rtl w:val="0"/>
+        </w:rPr>
+        <w:t xml:space="preserve">Scavengers:</w:t>
+      </w:r>
+      <w:r>
+        <w:rPr>
+          <w:rtl w:val="0"/>
+        </w:rPr>
+        <w:t xml:space="preserve"> You were born into this class. Scavengers are driven by an irresistible compulsion to seek, uncover, and gather the lost fragments of the world. Your suit functions as a potent symbiotic organism that neutralizes the chaotic energy of fallen enemies. You are the universe's final immune response, scavenging the remnants of the old world to extinguish the factions' ideologies and return the cosmos to a state of absolute silence.</w:t>
+      </w:r>
+    </w:p>
+    <w:p>
+      <w:pPr>
+        <w:numPr>
+          <w:ilvl w:val="0"/>
+          <w:numId w:val="3"/>
+        </w:numPr>
+        <w:spacing w:after="0" w:afterAutospacing="0" w:before="0" w:beforeAutospacing="0" w:lineRule="auto"/>
+        <w:ind w:left="720" w:hanging="360"/>
+      </w:pPr>
+      <w:r>
+        <w:rPr>
+          <w:b w:val="1"/>
+          <w:bCs w:val="1"/>
+          <w:rtl w:val="0"/>
+        </w:rPr>
+        <w:t xml:space="preserve">Light Guardians:</w:t>
+      </w:r>
+      <w:r>
+        <w:rPr>
+          <w:rtl w:val="0"/>
+        </w:rPr>
+        <w:t xml:space="preserve"> Born with the unyielding instinct to protect the individual. They are the immediate defenders of their allies in the heat of battle, throwing themselves into harm's way to ensure the survival of the anomaly fighting beside them. Your first ally, Ruy, is a Light Guardian who dedicates his life to your personal defense.</w:t>
+      </w:r>
+    </w:p>
+    <w:p>
+      <w:pPr>
+        <w:numPr>
+          <w:ilvl w:val="0"/>
+          <w:numId w:val="3"/>
+        </w:numPr>
+        <w:spacing w:after="0" w:afterAutospacing="0" w:before="0" w:beforeAutospacing="0" w:lineRule="auto"/>
+        <w:ind w:left="720" w:hanging="360"/>
+      </w:pPr>
+      <w:r>
+        <w:rPr>
+          <w:b w:val="1"/>
+          <w:bCs w:val="1"/>
+          <w:rtl w:val="0"/>
+        </w:rPr>
+        <w:t xml:space="preserve">Protectors:</w:t>
+      </w:r>
+      <w:r>
+        <w:rPr>
+          <w:rtl w:val="0"/>
+        </w:rPr>
+        <w:t xml:space="preserve"> While Light Guardians protect the individual, Protectors are concerned with the survival of the entire species. They are the strategic wardens of the Anomaly lineage, driven to establish safe havens, guard the dormant eggs of defeated allies, and ensure the long-term continuation of their kind against the cosmic threat.</w:t>
+      </w:r>
+    </w:p>
+    <w:p>
+      <w:pPr>
+        <w:numPr>
+          <w:ilvl w:val="0"/>
+          <w:numId w:val="3"/>
+        </w:numPr>
+        <w:spacing w:after="0" w:afterAutospacing="0" w:before="0" w:beforeAutospacing="0" w:lineRule="auto"/>
+        <w:ind w:left="720" w:hanging="360"/>
+      </w:pPr>
+      <w:r>
+        <w:rPr>
+          <w:b w:val="1"/>
+          <w:bCs w:val="1"/>
+          <w:rtl w:val="0"/>
+        </w:rPr>
+        <w:t xml:space="preserve">Enforcers:</w:t>
+      </w:r>
+      <w:r>
+        <w:rPr>
+          <w:rtl w:val="0"/>
+        </w:rPr>
+        <w:t xml:space="preserve"> The proactive vanguard. Enforcers do not wait to be attacked; their biological imperative is to take direct, aggressive action against cosmic threats. They are the frontline fighters, built to disrupt and dismantle the factions' operations before they can strike.</w:t>
+      </w:r>
+    </w:p>
+    <w:p>
+      <w:pPr>
+        <w:numPr>
+          <w:ilvl w:val="0"/>
+          <w:numId w:val="3"/>
+        </w:numPr>
+        <w:spacing w:after="240" w:before="0" w:beforeAutospacing="0" w:lineRule="auto"/>
+        <w:ind w:left="720" w:hanging="360"/>
+      </w:pPr>
+      <w:r>
+        <w:rPr>
+          <w:b w:val="1"/>
+          <w:bCs w:val="1"/>
+          <w:rtl w:val="0"/>
+        </w:rPr>
+        <w:t xml:space="preserve">Techies:</w:t>
+      </w:r>
+      <w:r>
+        <w:rPr>
+          <w:rtl w:val="0"/>
+        </w:rPr>
+        <w:t xml:space="preserve"> Anomalies of a highly technical nature. They possess an innate, instinctual understanding of the complex, bio-mechanical systems and chaotic machinery left behind by the factions, allowing them to interface with, manipulate, and shatter the enemy's technological infrastructure.</w:t>
+      </w:r>
+    </w:p>
+    <w:p>
+      <w:pPr>
+        <w:spacing w:after="240" w:before="240" w:lineRule="auto"/>
         <w:rPr/>
       </w:pPr>
       <w:r>
         <w:rPr>
           <w:rtl w:val="0"/>
         </w:rPr>
-        <w:t xml:space="preserve">Driven by mounting desperation, your implacable enemies continually escalate their assaults, resorting to calling down planetary cataclysms—the dreaded MegaStorms—or deploying overwhelming, yet ultimately futile, displays of military might. They remain utterly ignorant of the method required to truly extinguish your core essence. This endless cycle of failure cultivates a paralyzing terror among the enemy alliances, solidifying the grim legend: the Anomaly cannot be destroyed, only momentarily delayed. These desperate, planet-scale disasters devastate the surrounding environment, yet they inadvertently serve only as rich, fertile resource fields for your rebirth. Each time your Scavenger form hatches from its protective shell, it is inherently more resilient and subtly further evolved. It has successfully metabolized the destructive ambient energy intended for your grave, converting it into the very blueprint for your next ascension. You are not a harbinger of peace, but the perfect apex predator, forged in the relentless crucible of total war and destined to flourish upon the destruction the universe craves.</w:t>
-      </w:r>
-    </w:p>
-    <w:p>
-      <w:pPr>
+        <w:t xml:space="preserve">Together, these five classes form a perfect cooperative synergy, diving into fractured instances of reality to hunt for Prism shards, solve the cosmic mysteries, and silence the vibrant madness.</w:t>
+      </w:r>
+    </w:p>
+    <w:p>
+      <w:pPr>
+        <w:spacing w:after="240" w:before="240" w:lineRule="auto"/>
         <w:rPr/>
       </w:pPr>
       <w:r>
         <w:rPr>
           <w:rtl w:val="0"/>
         </w:rPr>
-      </w:r>
-    </w:p>
-    <w:p>
-      <w:pPr>
+        <w:t xml:space="preserve">Driven by mounting desperation, your implacable enemies continually escalate their assaults. When massive, incompatible ideologies collide, their opposing Conviction Cores violently reject one another. The resulting friction manifests as planetary cataclysms—the dreaded MegaStorms. These desperate, hyper-colorful disasters devastate the environment, yet they inadvertently serve as rich resource fields for your Scavenger rebirth.</w:t>
+      </w:r>
+    </w:p>
+    <w:p>
+      <w:pPr>
+        <w:spacing w:after="240" w:before="240" w:lineRule="auto"/>
         <w:rPr/>
       </w:pPr>
       <w:r>
         <w:rPr>
           <w:rtl w:val="0"/>
         </w:rPr>
-        <w:t xml:space="preserve">Amidst this perpetual conflict, you find your first ally: Ruy, a light guardian class, who chooses to offer his friendship and dedicate himself to the defense of your kind.</w:t>
-      </w:r>
-    </w:p>
-    <w:p>
-      <w:pPr>
+        <w:t xml:space="preserve">Tarrastra &amp; The Unaligned Tarrastra itself is a vibrant, lush world. Dominating the landscape is a grand, bustling metropolis perched atop a vast hill. Towering buildings stretch as far as the eye can see, piercing the sky where flying vehicles weave through the air. However, beneath the soaring towers and the magical, hyper-colorful battles of the factions, the ground level is populated by ordinary humans—The Unaligned.</w:t>
+      </w:r>
+    </w:p>
+    <w:p>
+      <w:pPr>
+        <w:spacing w:after="240" w:before="240" w:lineRule="auto"/>
         <w:rPr/>
       </w:pPr>
       <w:r>
         <w:rPr>
           <w:rtl w:val="0"/>
         </w:rPr>
-      </w:r>
-    </w:p>
-    <w:p>
-      <w:pPr>
+        <w:t xml:space="preserve">These everyday citizens have absolutely nothing to do with the grand cosmic conflicts. They are shopkeepers, mechanics, and commuters simply trying to pay their rent, run their dynamic shops, and live their lives. To them, the warring ideologies and explosive magic overhead are treated like extreme weather or annoying political noise. They are the silent heartbeat of the city, keeping the physical world turning while trying their best to ignore the colorful tyranny of the skies. You and your allies are always on the lookout for the next attack, fighting to ensure these neutral lives are not entirely swallowed by the ideological storms.</w:t>
+      </w:r>
+    </w:p>
+    <w:p>
+      <w:pPr>
+        <w:pStyle w:val="Heading1"/>
         <w:rPr/>
       </w:pPr>
-      <w:r>
-        <w:rPr>
-          <w:rtl w:val="0"/>
-        </w:rPr>
-        <w:t xml:space="preserve">Tarrastra itself is a vibrant, lush world, home to a multitude of diverse species. Dominating the landscape is a grand, bustling metropolis perched atop a vast hill. Towering buildings stretch as far as the eye can see, piercing the sky. The air above the city is thick with flying vehicles, and the ground level is a maze of active, dynamic shops, underscoring the relentless, vibrant energy of this grand capital.</w:t>
-      </w:r>
-    </w:p>
-    <w:p>
-      <w:pPr>
+      <w:bookmarkStart w:colFirst="0" w:colLast="0" w:name="_x7vehq1xlt7c" w:id="1"/>
+      <w:bookmarkEnd w:id="1"/>
+      <w:r>
+        <w:rPr>
+          <w:rtl w:val="0"/>
+        </w:rPr>
+        <w:t xml:space="preserve">The Factions[Subject to change]</w:t>
+      </w:r>
+    </w:p>
+    <w:p>
+      <w:pPr>
+        <w:spacing w:after="240" w:before="240" w:lineRule="auto"/>
         <w:rPr/>
       </w:pPr>
       <w:r>
         <w:rPr>
-          <w:rtl w:val="0"/>
-        </w:rPr>
-        <w:br w:type="textWrapping"/>
-        <w:t xml:space="preserve">Coming soon.</w:t>
+          <w:b w:val="1"/>
+          <w:bCs w:val="1"/>
+          <w:rtl w:val="0"/>
+        </w:rPr>
+        <w:t xml:space="preserve">The Ledger Dynasty</w:t>
+      </w:r>
+      <w:r>
+        <w:rPr>
+          <w:rtl w:val="0"/>
+        </w:rPr>
+        <w:t xml:space="preserve"> The Dynasty embodies hyper-capitalism and digital avarice. They are no longer merely greedy; they are a collective obsessed with optimizing all existence into a quantified, tradable asset. Their bodies are skeletal, yet augmented with proprietary tech to minimize biological overhead. Their power manifests as unbreakable smart contracts and shimmering golden algorithms projected by their Conviction Core.</w:t>
+      </w:r>
+    </w:p>
+    <w:p>
+      <w:pPr>
+        <w:numPr>
+          <w:ilvl w:val="0"/>
+          <w:numId w:val="5"/>
+        </w:numPr>
+        <w:spacing w:after="240" w:before="240" w:lineRule="auto"/>
+        <w:ind w:left="720" w:hanging="360"/>
+      </w:pPr>
+      <w:r>
+        <w:rPr>
+          <w:b w:val="1"/>
+          <w:bCs w:val="1"/>
+          <w:rtl w:val="0"/>
+        </w:rPr>
+        <w:t xml:space="preserve">Ultimate Goal:</w:t>
+      </w:r>
+      <w:r>
+        <w:rPr>
+          <w:rtl w:val="0"/>
+        </w:rPr>
+        <w:t xml:space="preserve"> Total Cosmic Ownership. They seek to commodify existence itself, aiming to capture the Anomalies so they can patent immortality and own the universe.</w:t>
+      </w:r>
+    </w:p>
+    <w:p>
+      <w:pPr>
+        <w:spacing w:after="240" w:before="240" w:lineRule="auto"/>
+        <w:rPr/>
+      </w:pPr>
+      <w:r>
+        <w:rPr>
+          <w:b w:val="1"/>
+          <w:bCs w:val="1"/>
+          <w:rtl w:val="0"/>
+        </w:rPr>
+        <w:t xml:space="preserve">The Neon Euphoria</w:t>
+      </w:r>
+      <w:r>
+        <w:rPr>
+          <w:rtl w:val="0"/>
+        </w:rPr>
+        <w:t xml:space="preserve"> This faction mandates absolute, non-stop bliss. They view any hint of negative emotion as a flaw in reality that must be violently purged. Clad in hyper-neon, candy-colored armor and wearing grotesque, eternally-smiling masks, their Conviction Core magic explodes as kinetic confetti, hard-light platforms, and volatile bubblegum shields, turning every conflict into a bouncy, frantic cartoon nightmare.</w:t>
+      </w:r>
+    </w:p>
+    <w:p>
+      <w:pPr>
+        <w:numPr>
+          <w:ilvl w:val="0"/>
+          <w:numId w:val="2"/>
+        </w:numPr>
+        <w:spacing w:after="240" w:before="240" w:lineRule="auto"/>
+        <w:ind w:left="720" w:hanging="360"/>
+      </w:pPr>
+      <w:r>
+        <w:rPr>
+          <w:b w:val="1"/>
+          <w:bCs w:val="1"/>
+          <w:rtl w:val="0"/>
+        </w:rPr>
+        <w:t xml:space="preserve">Ultimate Goal:</w:t>
+      </w:r>
+      <w:r>
+        <w:rPr>
+          <w:rtl w:val="0"/>
+        </w:rPr>
+        <w:t xml:space="preserve"> The Eradication of Sorrow. They seek to violently overwrite all reality into a state of mindless, mandatory joy, destroying any trace of complex thought or individual struggle.</w:t>
+      </w:r>
+    </w:p>
+    <w:p>
+      <w:pPr>
+        <w:spacing w:after="240" w:before="240" w:lineRule="auto"/>
+        <w:rPr/>
+      </w:pPr>
+      <w:r>
+        <w:rPr>
+          <w:b w:val="1"/>
+          <w:bCs w:val="1"/>
+          <w:rtl w:val="0"/>
+        </w:rPr>
+        <w:t xml:space="preserve">The Geo-Engineers</w:t>
+      </w:r>
+      <w:r>
+        <w:rPr>
+          <w:rtl w:val="0"/>
+        </w:rPr>
+        <w:t xml:space="preserve"> The Geo-Engineers champion a fanatical belief in synthetic ecology. Appearing as towering, walking life-support systems covered in rust-orange and acid-green glowing vines, their terror lies in their power to weaponize the environment itself. They use their Conviction Core to shoot grasping, hardened vines and emit gravity-altering, bio-mechanical spores.</w:t>
+      </w:r>
+    </w:p>
+    <w:p>
+      <w:pPr>
+        <w:numPr>
+          <w:ilvl w:val="0"/>
+          <w:numId w:val="1"/>
+        </w:numPr>
+        <w:spacing w:after="240" w:before="240" w:lineRule="auto"/>
+        <w:ind w:left="720" w:hanging="360"/>
+      </w:pPr>
+      <w:r>
+        <w:rPr>
+          <w:b w:val="1"/>
+          <w:bCs w:val="1"/>
+          <w:rtl w:val="0"/>
+        </w:rPr>
+        <w:t xml:space="preserve">Ultimate Goal:</w:t>
+      </w:r>
+      <w:r>
+        <w:rPr>
+          <w:rtl w:val="0"/>
+        </w:rPr>
+        <w:t xml:space="preserve"> Complete Synthetic Assimilation. They seek to forcibly conquer nature, replacing all organic, unpredictable life with a perfectly controlled, brutal bio-mechanical ecosystem.</w:t>
+      </w:r>
+    </w:p>
+    <w:p>
+      <w:pPr>
+        <w:spacing w:after="240" w:before="240" w:lineRule="auto"/>
+        <w:rPr/>
+      </w:pPr>
+      <w:r>
+        <w:rPr>
+          <w:b w:val="1"/>
+          <w:bCs w:val="1"/>
+          <w:rtl w:val="0"/>
+        </w:rPr>
+        <w:t xml:space="preserve">The Sync State</w:t>
+      </w:r>
+      <w:r>
+        <w:rPr>
+          <w:rtl w:val="0"/>
+        </w:rPr>
+        <w:t xml:space="preserve"> This collective perceives free will as unacceptable noise in the cosmic machine. They move with elegant, chilling synchronization, dressed in severe white and streamlined gold armor. Their power is derived from weaponizing mathematical harmony: their movements generate visible, physical soundwaves and glowing geometric shapes that strike with fatal, synchronized precision.</w:t>
+      </w:r>
+    </w:p>
+    <w:p>
+      <w:pPr>
+        <w:numPr>
+          <w:ilvl w:val="0"/>
+          <w:numId w:val="4"/>
+        </w:numPr>
+        <w:spacing w:after="240" w:before="240" w:lineRule="auto"/>
+        <w:ind w:left="720" w:hanging="360"/>
+      </w:pPr>
+      <w:r>
+        <w:rPr>
+          <w:b w:val="1"/>
+          <w:bCs w:val="1"/>
+          <w:rtl w:val="0"/>
+        </w:rPr>
+        <w:t xml:space="preserve">Ultimate Goal:</w:t>
+      </w:r>
+      <w:r>
+        <w:rPr>
+          <w:rtl w:val="0"/>
+        </w:rPr>
+        <w:t xml:space="preserve"> The Elimination of Individuality. They seek to reduce the entire universe and everyone in it into a single, perfectly synchronized, mindless mechanism with no free will.</w:t>
+      </w:r>
+    </w:p>
+    <w:p>
+      <w:pPr>
+        <w:spacing w:after="240" w:before="240" w:lineRule="auto"/>
+        <w:rPr>
+          <w:b w:val="1"/>
+          <w:bCs w:val="1"/>
+          <w:sz w:val="26"/>
+          <w:szCs w:val="26"/>
+        </w:rPr>
+      </w:pPr>
+      <w:r>
+        <w:rPr>
+          <w:rtl w:val="0"/>
+        </w:rPr>
+      </w:r>
+    </w:p>
+    <w:p>
+      <w:pPr>
+        <w:rPr/>
+      </w:pPr>
+      <w:r>
+        <w:rPr>
+          <w:rtl w:val="0"/>
+        </w:rPr>
       </w:r>
     </w:p>
     <w:sectPr>
@@ -151,7 +483,573 @@
 </file>
 
 <file path=word/numbering.xml><?xml version="1.0" encoding="utf-8"?>
-<w:numbering xmlns:mc="http://schemas.openxmlformats.org/markup-compatibility/2006" xmlns:o="urn:schemas-microsoft-com:office:office" xmlns:r="http://schemas.openxmlformats.org/officeDocument/2006/relationships" xmlns:m="http://schemas.openxmlformats.org/officeDocument/2006/math" xmlns:v="urn:schemas-microsoft-com:vml" xmlns:wp="http://schemas.openxmlformats.org/drawingml/2006/wordprocessingDrawing" xmlns:w10="urn:schemas-microsoft-com:office:word" xmlns:w="http://schemas.openxmlformats.org/wordprocessingml/2006/main" xmlns:wne="http://schemas.microsoft.com/office/word/2006/wordml" xmlns:sl="http://schemas.openxmlformats.org/schemaLibrary/2006/main" xmlns:a="http://schemas.openxmlformats.org/drawingml/2006/main" xmlns:pic="http://schemas.openxmlformats.org/drawingml/2006/picture" xmlns:c="http://schemas.openxmlformats.org/drawingml/2006/chart" xmlns:lc="http://schemas.openxmlformats.org/drawingml/2006/lockedCanvas" xmlns:dgm="http://schemas.openxmlformats.org/drawingml/2006/diagram" xmlns:wps="http://schemas.microsoft.com/office/word/2010/wordprocessingShape" xmlns:wpg="http://schemas.microsoft.com/office/word/2010/wordprocessingGroup" xmlns:w14="http://schemas.microsoft.com/office/word/2010/wordml" xmlns:w15="http://schemas.microsoft.com/office/word/2012/wordml" xmlns:w16="http://schemas.microsoft.com/office/word/2018/wordml" xmlns:w16cex="http://schemas.microsoft.com/office/word/2018/wordml/cex" xmlns:w16cid="http://schemas.microsoft.com/office/word/2016/wordml/cid" xmlns="http://schemas.microsoft.com/office/tasks/2019/documenttasks" xmlns:cr="http://schemas.microsoft.com/office/comments/2020/reactions"/>
+<w:numbering xmlns:mc="http://schemas.openxmlformats.org/markup-compatibility/2006" xmlns:o="urn:schemas-microsoft-com:office:office" xmlns:r="http://schemas.openxmlformats.org/officeDocument/2006/relationships" xmlns:m="http://schemas.openxmlformats.org/officeDocument/2006/math" xmlns:v="urn:schemas-microsoft-com:vml" xmlns:wp="http://schemas.openxmlformats.org/drawingml/2006/wordprocessingDrawing" xmlns:w10="urn:schemas-microsoft-com:office:word" xmlns:w="http://schemas.openxmlformats.org/wordprocessingml/2006/main" xmlns:wne="http://schemas.microsoft.com/office/word/2006/wordml" xmlns:sl="http://schemas.openxmlformats.org/schemaLibrary/2006/main" xmlns:a="http://schemas.openxmlformats.org/drawingml/2006/main" xmlns:pic="http://schemas.openxmlformats.org/drawingml/2006/picture" xmlns:c="http://schemas.openxmlformats.org/drawingml/2006/chart" xmlns:lc="http://schemas.openxmlformats.org/drawingml/2006/lockedCanvas" xmlns:dgm="http://schemas.openxmlformats.org/drawingml/2006/diagram" xmlns:wps="http://schemas.microsoft.com/office/word/2010/wordprocessingShape" xmlns:wpg="http://schemas.microsoft.com/office/word/2010/wordprocessingGroup" xmlns:w14="http://schemas.microsoft.com/office/word/2010/wordml" xmlns:w15="http://schemas.microsoft.com/office/word/2012/wordml" xmlns:w16="http://schemas.microsoft.com/office/word/2018/wordml" xmlns:w16cex="http://schemas.microsoft.com/office/word/2018/wordml/cex" xmlns:w16cid="http://schemas.microsoft.com/office/word/2016/wordml/cid" xmlns="http://schemas.microsoft.com/office/tasks/2019/documenttasks" xmlns:cr="http://schemas.microsoft.com/office/comments/2020/reactions">
+  <w:abstractNum w:abstractNumId="1">
+    <w:lvl w:ilvl="0">
+      <w:start w:val="1"/>
+      <w:numFmt w:val="bullet"/>
+      <w:lvlText w:val="●"/>
+      <w:lvlJc w:val="left"/>
+      <w:pPr>
+        <w:ind w:left="720" w:hanging="360"/>
+      </w:pPr>
+      <w:rPr>
+        <w:u w:val="none"/>
+      </w:rPr>
+    </w:lvl>
+    <w:lvl w:ilvl="1">
+      <w:start w:val="1"/>
+      <w:numFmt w:val="bullet"/>
+      <w:lvlText w:val="○"/>
+      <w:lvlJc w:val="left"/>
+      <w:pPr>
+        <w:ind w:left="1440" w:hanging="360"/>
+      </w:pPr>
+      <w:rPr>
+        <w:u w:val="none"/>
+      </w:rPr>
+    </w:lvl>
+    <w:lvl w:ilvl="2">
+      <w:start w:val="1"/>
+      <w:numFmt w:val="bullet"/>
+      <w:lvlText w:val="■"/>
+      <w:lvlJc w:val="left"/>
+      <w:pPr>
+        <w:ind w:left="2160" w:hanging="360"/>
+      </w:pPr>
+      <w:rPr>
+        <w:u w:val="none"/>
+      </w:rPr>
+    </w:lvl>
+    <w:lvl w:ilvl="3">
+      <w:start w:val="1"/>
+      <w:numFmt w:val="bullet"/>
+      <w:lvlText w:val="●"/>
+      <w:lvlJc w:val="left"/>
+      <w:pPr>
+        <w:ind w:left="2880" w:hanging="360"/>
+      </w:pPr>
+      <w:rPr>
+        <w:u w:val="none"/>
+      </w:rPr>
+    </w:lvl>
+    <w:lvl w:ilvl="4">
+      <w:start w:val="1"/>
+      <w:numFmt w:val="bullet"/>
+      <w:lvlText w:val="○"/>
+      <w:lvlJc w:val="left"/>
+      <w:pPr>
+        <w:ind w:left="3600" w:hanging="360"/>
+      </w:pPr>
+      <w:rPr>
+        <w:u w:val="none"/>
+      </w:rPr>
+    </w:lvl>
+    <w:lvl w:ilvl="5">
+      <w:start w:val="1"/>
+      <w:numFmt w:val="bullet"/>
+      <w:lvlText w:val="■"/>
+      <w:lvlJc w:val="left"/>
+      <w:pPr>
+        <w:ind w:left="4320" w:hanging="360"/>
+      </w:pPr>
+      <w:rPr>
+        <w:u w:val="none"/>
+      </w:rPr>
+    </w:lvl>
+    <w:lvl w:ilvl="6">
+      <w:start w:val="1"/>
+      <w:numFmt w:val="bullet"/>
+      <w:lvlText w:val="●"/>
+      <w:lvlJc w:val="left"/>
+      <w:pPr>
+        <w:ind w:left="5040" w:hanging="360"/>
+      </w:pPr>
+      <w:rPr>
+        <w:u w:val="none"/>
+      </w:rPr>
+    </w:lvl>
+    <w:lvl w:ilvl="7">
+      <w:start w:val="1"/>
+      <w:numFmt w:val="bullet"/>
+      <w:lvlText w:val="○"/>
+      <w:lvlJc w:val="left"/>
+      <w:pPr>
+        <w:ind w:left="5760" w:hanging="360"/>
+      </w:pPr>
+      <w:rPr>
+        <w:u w:val="none"/>
+      </w:rPr>
+    </w:lvl>
+    <w:lvl w:ilvl="8">
+      <w:start w:val="1"/>
+      <w:numFmt w:val="bullet"/>
+      <w:lvlText w:val="■"/>
+      <w:lvlJc w:val="left"/>
+      <w:pPr>
+        <w:ind w:left="6480" w:hanging="360"/>
+      </w:pPr>
+      <w:rPr>
+        <w:u w:val="none"/>
+      </w:rPr>
+    </w:lvl>
+  </w:abstractNum>
+  <w:abstractNum w:abstractNumId="2">
+    <w:lvl w:ilvl="0">
+      <w:start w:val="1"/>
+      <w:numFmt w:val="bullet"/>
+      <w:lvlText w:val="●"/>
+      <w:lvlJc w:val="left"/>
+      <w:pPr>
+        <w:ind w:left="720" w:hanging="360"/>
+      </w:pPr>
+      <w:rPr>
+        <w:u w:val="none"/>
+      </w:rPr>
+    </w:lvl>
+    <w:lvl w:ilvl="1">
+      <w:start w:val="1"/>
+      <w:numFmt w:val="bullet"/>
+      <w:lvlText w:val="○"/>
+      <w:lvlJc w:val="left"/>
+      <w:pPr>
+        <w:ind w:left="1440" w:hanging="360"/>
+      </w:pPr>
+      <w:rPr>
+        <w:u w:val="none"/>
+      </w:rPr>
+    </w:lvl>
+    <w:lvl w:ilvl="2">
+      <w:start w:val="1"/>
+      <w:numFmt w:val="bullet"/>
+      <w:lvlText w:val="■"/>
+      <w:lvlJc w:val="left"/>
+      <w:pPr>
+        <w:ind w:left="2160" w:hanging="360"/>
+      </w:pPr>
+      <w:rPr>
+        <w:u w:val="none"/>
+      </w:rPr>
+    </w:lvl>
+    <w:lvl w:ilvl="3">
+      <w:start w:val="1"/>
+      <w:numFmt w:val="bullet"/>
+      <w:lvlText w:val="●"/>
+      <w:lvlJc w:val="left"/>
+      <w:pPr>
+        <w:ind w:left="2880" w:hanging="360"/>
+      </w:pPr>
+      <w:rPr>
+        <w:u w:val="none"/>
+      </w:rPr>
+    </w:lvl>
+    <w:lvl w:ilvl="4">
+      <w:start w:val="1"/>
+      <w:numFmt w:val="bullet"/>
+      <w:lvlText w:val="○"/>
+      <w:lvlJc w:val="left"/>
+      <w:pPr>
+        <w:ind w:left="3600" w:hanging="360"/>
+      </w:pPr>
+      <w:rPr>
+        <w:u w:val="none"/>
+      </w:rPr>
+    </w:lvl>
+    <w:lvl w:ilvl="5">
+      <w:start w:val="1"/>
+      <w:numFmt w:val="bullet"/>
+      <w:lvlText w:val="■"/>
+      <w:lvlJc w:val="left"/>
+      <w:pPr>
+        <w:ind w:left="4320" w:hanging="360"/>
+      </w:pPr>
+      <w:rPr>
+        <w:u w:val="none"/>
+      </w:rPr>
+    </w:lvl>
+    <w:lvl w:ilvl="6">
+      <w:start w:val="1"/>
+      <w:numFmt w:val="bullet"/>
+      <w:lvlText w:val="●"/>
+      <w:lvlJc w:val="left"/>
+      <w:pPr>
+        <w:ind w:left="5040" w:hanging="360"/>
+      </w:pPr>
+      <w:rPr>
+        <w:u w:val="none"/>
+      </w:rPr>
+    </w:lvl>
+    <w:lvl w:ilvl="7">
+      <w:start w:val="1"/>
+      <w:numFmt w:val="bullet"/>
+      <w:lvlText w:val="○"/>
+      <w:lvlJc w:val="left"/>
+      <w:pPr>
+        <w:ind w:left="5760" w:hanging="360"/>
+      </w:pPr>
+      <w:rPr>
+        <w:u w:val="none"/>
+      </w:rPr>
+    </w:lvl>
+    <w:lvl w:ilvl="8">
+      <w:start w:val="1"/>
+      <w:numFmt w:val="bullet"/>
+      <w:lvlText w:val="■"/>
+      <w:lvlJc w:val="left"/>
+      <w:pPr>
+        <w:ind w:left="6480" w:hanging="360"/>
+      </w:pPr>
+      <w:rPr>
+        <w:u w:val="none"/>
+      </w:rPr>
+    </w:lvl>
+  </w:abstractNum>
+  <w:abstractNum w:abstractNumId="3">
+    <w:lvl w:ilvl="0">
+      <w:start w:val="1"/>
+      <w:numFmt w:val="bullet"/>
+      <w:lvlText w:val="●"/>
+      <w:lvlJc w:val="left"/>
+      <w:pPr>
+        <w:ind w:left="720" w:hanging="360"/>
+      </w:pPr>
+      <w:rPr>
+        <w:u w:val="none"/>
+      </w:rPr>
+    </w:lvl>
+    <w:lvl w:ilvl="1">
+      <w:start w:val="1"/>
+      <w:numFmt w:val="bullet"/>
+      <w:lvlText w:val="○"/>
+      <w:lvlJc w:val="left"/>
+      <w:pPr>
+        <w:ind w:left="1440" w:hanging="360"/>
+      </w:pPr>
+      <w:rPr>
+        <w:u w:val="none"/>
+      </w:rPr>
+    </w:lvl>
+    <w:lvl w:ilvl="2">
+      <w:start w:val="1"/>
+      <w:numFmt w:val="bullet"/>
+      <w:lvlText w:val="■"/>
+      <w:lvlJc w:val="left"/>
+      <w:pPr>
+        <w:ind w:left="2160" w:hanging="360"/>
+      </w:pPr>
+      <w:rPr>
+        <w:u w:val="none"/>
+      </w:rPr>
+    </w:lvl>
+    <w:lvl w:ilvl="3">
+      <w:start w:val="1"/>
+      <w:numFmt w:val="bullet"/>
+      <w:lvlText w:val="●"/>
+      <w:lvlJc w:val="left"/>
+      <w:pPr>
+        <w:ind w:left="2880" w:hanging="360"/>
+      </w:pPr>
+      <w:rPr>
+        <w:u w:val="none"/>
+      </w:rPr>
+    </w:lvl>
+    <w:lvl w:ilvl="4">
+      <w:start w:val="1"/>
+      <w:numFmt w:val="bullet"/>
+      <w:lvlText w:val="○"/>
+      <w:lvlJc w:val="left"/>
+      <w:pPr>
+        <w:ind w:left="3600" w:hanging="360"/>
+      </w:pPr>
+      <w:rPr>
+        <w:u w:val="none"/>
+      </w:rPr>
+    </w:lvl>
+    <w:lvl w:ilvl="5">
+      <w:start w:val="1"/>
+      <w:numFmt w:val="bullet"/>
+      <w:lvlText w:val="■"/>
+      <w:lvlJc w:val="left"/>
+      <w:pPr>
+        <w:ind w:left="4320" w:hanging="360"/>
+      </w:pPr>
+      <w:rPr>
+        <w:u w:val="none"/>
+      </w:rPr>
+    </w:lvl>
+    <w:lvl w:ilvl="6">
+      <w:start w:val="1"/>
+      <w:numFmt w:val="bullet"/>
+      <w:lvlText w:val="●"/>
+      <w:lvlJc w:val="left"/>
+      <w:pPr>
+        <w:ind w:left="5040" w:hanging="360"/>
+      </w:pPr>
+      <w:rPr>
+        <w:u w:val="none"/>
+      </w:rPr>
+    </w:lvl>
+    <w:lvl w:ilvl="7">
+      <w:start w:val="1"/>
+      <w:numFmt w:val="bullet"/>
+      <w:lvlText w:val="○"/>
+      <w:lvlJc w:val="left"/>
+      <w:pPr>
+        <w:ind w:left="5760" w:hanging="360"/>
+      </w:pPr>
+      <w:rPr>
+        <w:u w:val="none"/>
+      </w:rPr>
+    </w:lvl>
+    <w:lvl w:ilvl="8">
+      <w:start w:val="1"/>
+      <w:numFmt w:val="bullet"/>
+      <w:lvlText w:val="■"/>
+      <w:lvlJc w:val="left"/>
+      <w:pPr>
+        <w:ind w:left="6480" w:hanging="360"/>
+      </w:pPr>
+      <w:rPr>
+        <w:u w:val="none"/>
+      </w:rPr>
+    </w:lvl>
+  </w:abstractNum>
+  <w:abstractNum w:abstractNumId="4">
+    <w:lvl w:ilvl="0">
+      <w:start w:val="1"/>
+      <w:numFmt w:val="bullet"/>
+      <w:lvlText w:val="●"/>
+      <w:lvlJc w:val="left"/>
+      <w:pPr>
+        <w:ind w:left="720" w:hanging="360"/>
+      </w:pPr>
+      <w:rPr>
+        <w:u w:val="none"/>
+      </w:rPr>
+    </w:lvl>
+    <w:lvl w:ilvl="1">
+      <w:start w:val="1"/>
+      <w:numFmt w:val="bullet"/>
+      <w:lvlText w:val="○"/>
+      <w:lvlJc w:val="left"/>
+      <w:pPr>
+        <w:ind w:left="1440" w:hanging="360"/>
+      </w:pPr>
+      <w:rPr>
+        <w:u w:val="none"/>
+      </w:rPr>
+    </w:lvl>
+    <w:lvl w:ilvl="2">
+      <w:start w:val="1"/>
+      <w:numFmt w:val="bullet"/>
+      <w:lvlText w:val="■"/>
+      <w:lvlJc w:val="left"/>
+      <w:pPr>
+        <w:ind w:left="2160" w:hanging="360"/>
+      </w:pPr>
+      <w:rPr>
+        <w:u w:val="none"/>
+      </w:rPr>
+    </w:lvl>
+    <w:lvl w:ilvl="3">
+      <w:start w:val="1"/>
+      <w:numFmt w:val="bullet"/>
+      <w:lvlText w:val="●"/>
+      <w:lvlJc w:val="left"/>
+      <w:pPr>
+        <w:ind w:left="2880" w:hanging="360"/>
+      </w:pPr>
+      <w:rPr>
+        <w:u w:val="none"/>
+      </w:rPr>
+    </w:lvl>
+    <w:lvl w:ilvl="4">
+      <w:start w:val="1"/>
+      <w:numFmt w:val="bullet"/>
+      <w:lvlText w:val="○"/>
+      <w:lvlJc w:val="left"/>
+      <w:pPr>
+        <w:ind w:left="3600" w:hanging="360"/>
+      </w:pPr>
+      <w:rPr>
+        <w:u w:val="none"/>
+      </w:rPr>
+    </w:lvl>
+    <w:lvl w:ilvl="5">
+      <w:start w:val="1"/>
+      <w:numFmt w:val="bullet"/>
+      <w:lvlText w:val="■"/>
+      <w:lvlJc w:val="left"/>
+      <w:pPr>
+        <w:ind w:left="4320" w:hanging="360"/>
+      </w:pPr>
+      <w:rPr>
+        <w:u w:val="none"/>
+      </w:rPr>
+    </w:lvl>
+    <w:lvl w:ilvl="6">
+      <w:start w:val="1"/>
+      <w:numFmt w:val="bullet"/>
+      <w:lvlText w:val="●"/>
+      <w:lvlJc w:val="left"/>
+      <w:pPr>
+        <w:ind w:left="5040" w:hanging="360"/>
+      </w:pPr>
+      <w:rPr>
+        <w:u w:val="none"/>
+      </w:rPr>
+    </w:lvl>
+    <w:lvl w:ilvl="7">
+      <w:start w:val="1"/>
+      <w:numFmt w:val="bullet"/>
+      <w:lvlText w:val="○"/>
+      <w:lvlJc w:val="left"/>
+      <w:pPr>
+        <w:ind w:left="5760" w:hanging="360"/>
+      </w:pPr>
+      <w:rPr>
+        <w:u w:val="none"/>
+      </w:rPr>
+    </w:lvl>
+    <w:lvl w:ilvl="8">
+      <w:start w:val="1"/>
+      <w:numFmt w:val="bullet"/>
+      <w:lvlText w:val="■"/>
+      <w:lvlJc w:val="left"/>
+      <w:pPr>
+        <w:ind w:left="6480" w:hanging="360"/>
+      </w:pPr>
+      <w:rPr>
+        <w:u w:val="none"/>
+      </w:rPr>
+    </w:lvl>
+  </w:abstractNum>
+  <w:abstractNum w:abstractNumId="5">
+    <w:lvl w:ilvl="0">
+      <w:start w:val="1"/>
+      <w:numFmt w:val="bullet"/>
+      <w:lvlText w:val="●"/>
+      <w:lvlJc w:val="left"/>
+      <w:pPr>
+        <w:ind w:left="720" w:hanging="360"/>
+      </w:pPr>
+      <w:rPr>
+        <w:u w:val="none"/>
+      </w:rPr>
+    </w:lvl>
+    <w:lvl w:ilvl="1">
+      <w:start w:val="1"/>
+      <w:numFmt w:val="bullet"/>
+      <w:lvlText w:val="○"/>
+      <w:lvlJc w:val="left"/>
+      <w:pPr>
+        <w:ind w:left="1440" w:hanging="360"/>
+      </w:pPr>
+      <w:rPr>
+        <w:u w:val="none"/>
+      </w:rPr>
+    </w:lvl>
+    <w:lvl w:ilvl="2">
+      <w:start w:val="1"/>
+      <w:numFmt w:val="bullet"/>
+      <w:lvlText w:val="■"/>
+      <w:lvlJc w:val="left"/>
+      <w:pPr>
+        <w:ind w:left="2160" w:hanging="360"/>
+      </w:pPr>
+      <w:rPr>
+        <w:u w:val="none"/>
+      </w:rPr>
+    </w:lvl>
+    <w:lvl w:ilvl="3">
+      <w:start w:val="1"/>
+      <w:numFmt w:val="bullet"/>
+      <w:lvlText w:val="●"/>
+      <w:lvlJc w:val="left"/>
+      <w:pPr>
+        <w:ind w:left="2880" w:hanging="360"/>
+      </w:pPr>
+      <w:rPr>
+        <w:u w:val="none"/>
+      </w:rPr>
+    </w:lvl>
+    <w:lvl w:ilvl="4">
+      <w:start w:val="1"/>
+      <w:numFmt w:val="bullet"/>
+      <w:lvlText w:val="○"/>
+      <w:lvlJc w:val="left"/>
+      <w:pPr>
+        <w:ind w:left="3600" w:hanging="360"/>
+      </w:pPr>
+      <w:rPr>
+        <w:u w:val="none"/>
+      </w:rPr>
+    </w:lvl>
+    <w:lvl w:ilvl="5">
+      <w:start w:val="1"/>
+      <w:numFmt w:val="bullet"/>
+      <w:lvlText w:val="■"/>
+      <w:lvlJc w:val="left"/>
+      <w:pPr>
+        <w:ind w:left="4320" w:hanging="360"/>
+      </w:pPr>
+      <w:rPr>
+        <w:u w:val="none"/>
+      </w:rPr>
+    </w:lvl>
+    <w:lvl w:ilvl="6">
+      <w:start w:val="1"/>
+      <w:numFmt w:val="bullet"/>
+      <w:lvlText w:val="●"/>
+      <w:lvlJc w:val="left"/>
+      <w:pPr>
+        <w:ind w:left="5040" w:hanging="360"/>
+      </w:pPr>
+      <w:rPr>
+        <w:u w:val="none"/>
+      </w:rPr>
+    </w:lvl>
+    <w:lvl w:ilvl="7">
+      <w:start w:val="1"/>
+      <w:numFmt w:val="bullet"/>
+      <w:lvlText w:val="○"/>
+      <w:lvlJc w:val="left"/>
+      <w:pPr>
+        <w:ind w:left="5760" w:hanging="360"/>
+      </w:pPr>
+      <w:rPr>
+        <w:u w:val="none"/>
+      </w:rPr>
+    </w:lvl>
+    <w:lvl w:ilvl="8">
+      <w:start w:val="1"/>
+      <w:numFmt w:val="bullet"/>
+      <w:lvlText w:val="■"/>
+      <w:lvlJc w:val="left"/>
+      <w:pPr>
+        <w:ind w:left="6480" w:hanging="360"/>
+      </w:pPr>
+      <w:rPr>
+        <w:u w:val="none"/>
+      </w:rPr>
+    </w:lvl>
+  </w:abstractNum>
+  <w:num w:numId="1">
+    <w:abstractNumId w:val="1"/>
+  </w:num>
+  <w:num w:numId="2">
+    <w:abstractNumId w:val="2"/>
+  </w:num>
+  <w:num w:numId="3">
+    <w:abstractNumId w:val="3"/>
+  </w:num>
+  <w:num w:numId="4">
+    <w:abstractNumId w:val="4"/>
+  </w:num>
+  <w:num w:numId="5">
+    <w:abstractNumId w:val="5"/>
+  </w:num>
+</w:numbering>
 </file>
 
 <file path=word/styles.xml><?xml version="1.0" encoding="utf-8"?>

</xml_diff>